<commit_message>
docs: embed experimental screenshots and official PR #5 into lab06 report
</commit_message>
<xml_diff>
--- a/Lab06_Akishev_IS-2406.docx
+++ b/Lab06_Akishev_IS-2406.docx
@@ -308,14 +308,14 @@
                 <w:color w:val="0F172A"/>
                 <w:sz w:val="19"/>
               </w:rPr>
-              <w:t>Status:</w:t>
+              <w:t>Pull Request:</w:t>
             </w:r>
             <w:r>
               <w:rPr>
                 <w:color w:val="334155"/>
                 <w:sz w:val="19"/>
               </w:rPr>
-              <w:t xml:space="preserve"> 100% Complete — Build Success, All 33 Automated Tests Passed</w:t>
+              <w:t xml:space="preserve"> https://github.com/adilkhanakishev/spring-lab-01/pull/5</w:t>
             </w:r>
           </w:p>
         </w:tc>
@@ -754,8 +754,6 @@
               <w:t>}</w:t>
               <w:br/>
               <w:br/>
-              <w:t>// Validator implementation:</w:t>
-              <w:br/>
               <w:t>public class NoDigitsValidator implements ConstraintValidator&lt;NoDigits, String&gt; {</w:t>
               <w:br/>
               <w:t xml:space="preserve">    @Override</w:t>
@@ -854,8 +852,6 @@
               <w:br/>
               <w:t>}</w:t>
               <w:br/>
-              <w:br/>
-              <w:t>// Validator implementation:</w:t>
               <w:br/>
               <w:t>public class ValidReprintYearValidator implements ConstraintValidator&lt;ValidReprintYear, BookForm&gt; {</w:t>
               <w:br/>
@@ -1000,7 +996,7 @@
               <w:br/>
               <w:t xml:space="preserve">    public String create(@Valid @ModelAttribute("form") BookForm form,</w:t>
               <w:br/>
-              <w:t xml:space="preserve">                         BindingResult binding,          // immediately after the form object!</w:t>
+              <w:t xml:space="preserve">                         BindingResult binding,          // immediately after form object!</w:t>
               <w:br/>
               <w:t xml:space="preserve">                         Model model,</w:t>
               <w:br/>
@@ -1144,211 +1140,6 @@
               <w:t xml:space="preserve">    }</w:t>
               <w:br/>
               <w:t>}</w:t>
-            </w:r>
-          </w:p>
-        </w:tc>
-      </w:tr>
-    </w:tbl>
-    <w:p>
-      <w:pPr>
-        <w:spacing w:after="80"/>
-      </w:pPr>
-    </w:p>
-    <w:p>
-      <w:pPr>
-        <w:keepNext/>
-        <w:spacing w:before="200" w:after="60"/>
-      </w:pPr>
-      <w:r>
-        <w:rPr>
-          <w:b/>
-          <w:color w:val="1D4ED8"/>
-          <w:sz w:val="23"/>
-        </w:rPr>
-        <w:t>Listing 6: Thymeleaf Form Template (books/form.html)</w:t>
-      </w:r>
-    </w:p>
-    <w:tbl>
-      <w:tblPr>
-        <w:tblW w:type="auto" w:w="0"/>
-        <w:jc w:val="center"/>
-        <w:tblLook w:firstColumn="1" w:firstRow="1" w:lastColumn="0" w:lastRow="0" w:noHBand="0" w:noVBand="1" w:val="04A0"/>
-        <w:tblBorders>
-          <w:top w:val="single" w:sz="4" w:space="0" w:color="CBD5E1"/>
-          <w:left w:val="single" w:sz="4" w:space="0" w:color="CBD5E1"/>
-          <w:bottom w:val="single" w:sz="4" w:space="0" w:color="CBD5E1"/>
-          <w:right w:val="single" w:sz="4" w:space="0" w:color="CBD5E1"/>
-          <w:insideH w:val="single" w:sz="4" w:space="0" w:color="CBD5E1"/>
-          <w:insideV w:val="single" w:sz="4" w:space="0" w:color="CBD5E1"/>
-        </w:tblBorders>
-      </w:tblPr>
-      <w:tblGrid>
-        <w:gridCol w:w="10080"/>
-      </w:tblGrid>
-      <w:tr>
-        <w:tc>
-          <w:tcPr>
-            <w:tcW w:type="dxa" w:w="10080"/>
-            <w:shd w:val="clear" w:color="auto" w:fill="F1F5F9"/>
-          </w:tcPr>
-          <w:p>
-            <w:pPr>
-              <w:spacing w:before="80" w:after="80" w:line="252" w:lineRule="auto"/>
-            </w:pPr>
-            <w:r>
-              <w:rPr>
-                <w:rFonts w:ascii="Consolas" w:hAnsi="Consolas"/>
-                <w:color w:val="0F172A"/>
-                <w:sz w:val="17"/>
-              </w:rPr>
-              <w:t>&lt;!DOCTYPE html&gt;</w:t>
-              <w:br/>
-              <w:t>&lt;html xmlns:th="http://www.thymeleaf.org"&gt;</w:t>
-              <w:br/>
-              <w:t>&lt;head&gt;</w:t>
-              <w:br/>
-              <w:t xml:space="preserve">    &lt;meta charset="UTF-8"&gt;</w:t>
-              <w:br/>
-              <w:t xml:space="preserve">    &lt;title th:text="#{book.new}"&gt;New book&lt;/title&gt;</w:t>
-              <w:br/>
-              <w:t xml:space="preserve">    &lt;link rel="stylesheet" th:href="@{/css/app.css}"&gt;</w:t>
-              <w:br/>
-              <w:t>&lt;/head&gt;</w:t>
-              <w:br/>
-              <w:t>&lt;body&gt;</w:t>
-              <w:br/>
-              <w:t xml:space="preserve">    &lt;div class="lang-switch"&gt;</w:t>
-              <w:br/>
-              <w:t xml:space="preserve">        &lt;span&gt;Language / Язык / Тіл:&lt;/span&gt;</w:t>
-              <w:br/>
-              <w:t xml:space="preserve">        &lt;a th:href="@{/books/new(lang='en')}"&gt;English&lt;/a&gt; |</w:t>
-              <w:br/>
-              <w:t xml:space="preserve">        &lt;a th:href="@{/books/new(lang='ru')}"&gt;Русский&lt;/a&gt; |</w:t>
-              <w:br/>
-              <w:t xml:space="preserve">        &lt;a th:href="@{/books/new(lang='kk')}"&gt;Қазақша&lt;/a&gt;</w:t>
-              <w:br/>
-              <w:t xml:space="preserve">    &lt;/div&gt;</w:t>
-              <w:br/>
-              <w:br/>
-              <w:t xml:space="preserve">    &lt;h1 th:text="#{book.new}"&gt;New book&lt;/h1&gt;</w:t>
-              <w:br/>
-              <w:br/>
-              <w:t xml:space="preserve">    &lt;form th:action="@{/books}" th:object="${form}" method="post"&gt;</w:t>
-              <w:br/>
-              <w:br/>
-              <w:t xml:space="preserve">        &lt;!-- Summary of all errors --&gt;</w:t>
-              <w:br/>
-              <w:t xml:space="preserve">        &lt;div class="alert" th:if="${#fields.hasAnyErrors()}"&gt;</w:t>
-              <w:br/>
-              <w:t xml:space="preserve">            &lt;h4&gt;Validation Errors:&lt;/h4&gt;</w:t>
-              <w:br/>
-              <w:t xml:space="preserve">            &lt;ul&gt;</w:t>
-              <w:br/>
-              <w:t xml:space="preserve">                &lt;li th:each="e : ${#fields.allErrors()}" th:text="${e}"&gt;&lt;/li&gt;</w:t>
-              <w:br/>
-              <w:t xml:space="preserve">            &lt;/ul&gt;</w:t>
-              <w:br/>
-              <w:t xml:space="preserve">        &lt;/div&gt;</w:t>
-              <w:br/>
-              <w:br/>
-              <w:t xml:space="preserve">        &lt;!-- Variant 2: Global errors summary --&gt;</w:t>
-              <w:br/>
-              <w:t xml:space="preserve">        &lt;div class="alert alert-global" th:if="${#fields.hasGlobalErrors()}"&gt;</w:t>
-              <w:br/>
-              <w:t xml:space="preserve">            &lt;p th:each="err : ${#fields.globalErrors()}" th:text="${err}"&gt;&lt;/p&gt;</w:t>
-              <w:br/>
-              <w:t xml:space="preserve">        &lt;/div&gt;</w:t>
-              <w:br/>
-              <w:br/>
-              <w:t xml:space="preserve">        &lt;div class="form-group"&gt;</w:t>
-              <w:br/>
-              <w:t xml:space="preserve">            &lt;label th:text="#{book.title}"&gt;Title&lt;/label&gt;</w:t>
-              <w:br/>
-              <w:t xml:space="preserve">            &lt;input type="text" th:field="*{title}" th:errorclass="is-invalid"&gt;</w:t>
-              <w:br/>
-              <w:t xml:space="preserve">            &lt;span class="error" th:if="${#fields.hasErrors('title')}" th:errors="*{title}"&gt;&lt;/span&gt;</w:t>
-              <w:br/>
-              <w:t xml:space="preserve">        &lt;/div&gt;</w:t>
-              <w:br/>
-              <w:br/>
-              <w:t xml:space="preserve">        &lt;div class="form-group"&gt;</w:t>
-              <w:br/>
-              <w:t xml:space="preserve">            &lt;label th:text="#{book.author}"&gt;Author&lt;/label&gt;</w:t>
-              <w:br/>
-              <w:t xml:space="preserve">            &lt;input type="text" th:field="*{author}" th:errorclass="is-invalid"&gt;</w:t>
-              <w:br/>
-              <w:t xml:space="preserve">            &lt;span class="error" th:if="${#fields.hasErrors('author')}" th:errors="*{author}"&gt;&lt;/span&gt;</w:t>
-              <w:br/>
-              <w:t xml:space="preserve">        &lt;/div&gt;</w:t>
-              <w:br/>
-              <w:br/>
-              <w:t xml:space="preserve">        &lt;div class="form-group"&gt;</w:t>
-              <w:br/>
-              <w:t xml:space="preserve">            &lt;label th:text="#{book.year}"&gt;Year&lt;/label&gt;</w:t>
-              <w:br/>
-              <w:t xml:space="preserve">            &lt;input type="number" th:field="*{year}" th:errorclass="is-invalid"&gt;</w:t>
-              <w:br/>
-              <w:t xml:space="preserve">            &lt;span class="error" th:if="${#fields.hasErrors('year')}" th:errors="*{year}"&gt;&lt;/span&gt;</w:t>
-              <w:br/>
-              <w:t xml:space="preserve">        &lt;/div&gt;</w:t>
-              <w:br/>
-              <w:br/>
-              <w:t xml:space="preserve">        &lt;!-- Variant 2: Reprint Year --&gt;</w:t>
-              <w:br/>
-              <w:t xml:space="preserve">        &lt;div class="form-group"&gt;</w:t>
-              <w:br/>
-              <w:t xml:space="preserve">            &lt;label th:text="#{book.reprintYear}"&gt;Reprint Year&lt;/label&gt;</w:t>
-              <w:br/>
-              <w:t xml:space="preserve">            &lt;input type="number" th:field="*{reprintYear}" th:errorclass="is-invalid"&gt;</w:t>
-              <w:br/>
-              <w:t xml:space="preserve">            &lt;span class="error" th:if="${#fields.hasErrors('reprintYear')}" th:errors="*{reprintYear}"&gt;&lt;/span&gt;</w:t>
-              <w:br/>
-              <w:t xml:space="preserve">        &lt;/div&gt;</w:t>
-              <w:br/>
-              <w:br/>
-              <w:t xml:space="preserve">        &lt;div class="form-group"&gt;</w:t>
-              <w:br/>
-              <w:t xml:space="preserve">            &lt;label th:text="#{book.genre}"&gt;Genre&lt;/label&gt;</w:t>
-              <w:br/>
-              <w:t xml:space="preserve">            &lt;select th:field="*{genre}" th:errorclass="is-invalid"&gt;</w:t>
-              <w:br/>
-              <w:t xml:space="preserve">                &lt;option value=""&gt;—&lt;/option&gt;</w:t>
-              <w:br/>
-              <w:t xml:space="preserve">                &lt;option th:each="g : ${genres}" th:value="${g}" th:text="${g}"&gt;&lt;/option&gt;</w:t>
-              <w:br/>
-              <w:t xml:space="preserve">            &lt;/select&gt;</w:t>
-              <w:br/>
-              <w:t xml:space="preserve">            &lt;span class="error" th:if="${#fields.hasErrors('genre')}" th:errors="*{genre}"&gt;&lt;/span&gt;</w:t>
-              <w:br/>
-              <w:t xml:space="preserve">        &lt;/div&gt;</w:t>
-              <w:br/>
-              <w:br/>
-              <w:t xml:space="preserve">        &lt;div class="form-group checkbox-group"&gt;</w:t>
-              <w:br/>
-              <w:t xml:space="preserve">            &lt;label&gt;</w:t>
-              <w:br/>
-              <w:t xml:space="preserve">                &lt;input type="checkbox" th:field="*{available}"&gt;</w:t>
-              <w:br/>
-              <w:t xml:space="preserve">                &lt;span th:text="#{book.available}"&gt;Available&lt;/span&gt;</w:t>
-              <w:br/>
-              <w:t xml:space="preserve">            &lt;/label&gt;</w:t>
-              <w:br/>
-              <w:t xml:space="preserve">        &lt;/div&gt;</w:t>
-              <w:br/>
-              <w:br/>
-              <w:t xml:space="preserve">        &lt;div class="form-actions"&gt;</w:t>
-              <w:br/>
-              <w:t xml:space="preserve">            &lt;button type="submit" th:text="#{form.submit}"&gt;Save&lt;/button&gt;</w:t>
-              <w:br/>
-              <w:t xml:space="preserve">            &lt;a th:href="@{/books}" class="btn-link" th:text="#{error.back}"&gt;Back to catalogue&lt;/a&gt;</w:t>
-              <w:br/>
-              <w:t xml:space="preserve">        &lt;/div&gt;</w:t>
-              <w:br/>
-              <w:t xml:space="preserve">    &lt;/form&gt;</w:t>
-              <w:br/>
-              <w:t>&lt;/body&gt;</w:t>
-              <w:br/>
-              <w:t>&lt;/html&gt;</w:t>
             </w:r>
           </w:p>
         </w:tc>
@@ -1656,24 +1447,331 @@
           <w:color w:val="1D4ED8"/>
           <w:sz w:val="23"/>
         </w:rPr>
-        <w:t>4.2. Form Validation Cases Verified</w:t>
+        <w:t>4.2. Visual Verification via Experimental Screenshots</w:t>
       </w:r>
     </w:p>
     <w:p>
+      <w:pPr>
+        <w:spacing w:before="120" w:after="40"/>
+        <w:jc w:val="center"/>
+      </w:pPr>
       <w:r>
-        <w:t>1. Case 1 (Empty Title): Submitting an empty title field causes @NotBlank violation. The page is redisplayed with HTTP 200, input field receives CSS class 'is-invalid', message 'The title must not be empty' is displayed, and user input is preserved.</w:t>
-        <w:br/>
-        <w:t>2. Case 2 (Year Out of Range): Submitting year 1200 causes @Min(1450) violation. Error message 'The year must be between 1450 and 2100' is displayed adjacent to the year input.</w:t>
-        <w:br/>
-        <w:t>3. Case 3 (Missing Genre): Leaving genre unselected violates @NotNull. Dropdown receives 'is-invalid' class and message 'Choose a genre'.</w:t>
-        <w:br/>
-        <w:t>4. Case 4 (Custom @NoDigits Violation): Submitting author 'Bloch 2018' violates NoDigits constraint. Message 'The author must not contain digits' is rendered.</w:t>
-        <w:br/>
-        <w:t>5. Case 5 (Variant 2 Class-Level Violation): Submitting first edition year 1994 and reprint year 1990 violates @ValidReprintYear. A Global Error is generated and rendered in the orange alert card via #fields.globalErrors(): 'A reprint year must not precede the first edition year'.</w:t>
-        <w:br/>
-        <w:t>6. Case 6 (Valid Submission PRG): Submitting valid book 'Clean Code' issues POST /books, persists book, attaches flash message, and returns 302 Redirect to /books. Browser follows redirect; flash message displays once. Pressing F5 re-executes safe GET without duplicate record creation.</w:t>
-        <w:br/>
-        <w:t>7. Case 7 (i18n Locale Switching): Switching to ?lang=ru dynamically changes all captions and validation errors to Russian. Switching to ?lang=kk renders complete Kazakh captions and validation errors.</w:t>
+        <w:drawing>
+          <wp:inline xmlns:a="http://schemas.openxmlformats.org/drawingml/2006/main" xmlns:pic="http://schemas.openxmlformats.org/drawingml/2006/picture">
+            <wp:extent cx="5486400" cy="2909292"/>
+            <wp:docPr id="1" name="Picture 1"/>
+            <wp:cNvGraphicFramePr>
+              <a:graphicFrameLocks noChangeAspect="1"/>
+            </wp:cNvGraphicFramePr>
+            <a:graphic>
+              <a:graphicData uri="http://schemas.openxmlformats.org/drawingml/2006/picture">
+                <pic:pic>
+                  <pic:nvPicPr>
+                    <pic:cNvPr id="0" name="screenshot_empty_title.png"/>
+                    <pic:cNvPicPr/>
+                  </pic:nvPicPr>
+                  <pic:blipFill>
+                    <a:blip r:embed="rId9"/>
+                    <a:stretch>
+                      <a:fillRect/>
+                    </a:stretch>
+                  </pic:blipFill>
+                  <pic:spPr>
+                    <a:xfrm>
+                      <a:off x="0" y="0"/>
+                      <a:ext cx="5486400" cy="2909292"/>
+                    </a:xfrm>
+                    <a:prstGeom prst="rect"/>
+                  </pic:spPr>
+                </pic:pic>
+              </a:graphicData>
+            </a:graphic>
+          </wp:inline>
+        </w:drawing>
+      </w:r>
+    </w:p>
+    <w:p>
+      <w:pPr>
+        <w:spacing w:before="0" w:after="160"/>
+        <w:jc w:val="center"/>
+      </w:pPr>
+      <w:r>
+        <w:rPr>
+          <w:i/>
+          <w:color w:val="475569"/>
+          <w:sz w:val="18"/>
+        </w:rPr>
+        <w:t>Figure 1: Empty title field rejection with inline error and Russian locale (Task 2.5 Case 1 &amp; Task 3)</w:t>
+      </w:r>
+    </w:p>
+    <w:p>
+      <w:pPr>
+        <w:spacing w:before="120" w:after="40"/>
+        <w:jc w:val="center"/>
+      </w:pPr>
+      <w:r>
+        <w:drawing>
+          <wp:inline xmlns:a="http://schemas.openxmlformats.org/drawingml/2006/main" xmlns:pic="http://schemas.openxmlformats.org/drawingml/2006/picture">
+            <wp:extent cx="5486400" cy="2909292"/>
+            <wp:docPr id="2" name="Picture 2"/>
+            <wp:cNvGraphicFramePr>
+              <a:graphicFrameLocks noChangeAspect="1"/>
+            </wp:cNvGraphicFramePr>
+            <a:graphic>
+              <a:graphicData uri="http://schemas.openxmlformats.org/drawingml/2006/picture">
+                <pic:pic>
+                  <pic:nvPicPr>
+                    <pic:cNvPr id="0" name="screenshot_year_range.png"/>
+                    <pic:cNvPicPr/>
+                  </pic:nvPicPr>
+                  <pic:blipFill>
+                    <a:blip r:embed="rId10"/>
+                    <a:stretch>
+                      <a:fillRect/>
+                    </a:stretch>
+                  </pic:blipFill>
+                  <pic:spPr>
+                    <a:xfrm>
+                      <a:off x="0" y="0"/>
+                      <a:ext cx="5486400" cy="2909292"/>
+                    </a:xfrm>
+                    <a:prstGeom prst="rect"/>
+                  </pic:spPr>
+                </pic:pic>
+              </a:graphicData>
+            </a:graphic>
+          </wp:inline>
+        </w:drawing>
+      </w:r>
+    </w:p>
+    <w:p>
+      <w:pPr>
+        <w:spacing w:before="0" w:after="160"/>
+        <w:jc w:val="center"/>
+      </w:pPr>
+      <w:r>
+        <w:rPr>
+          <w:i/>
+          <w:color w:val="475569"/>
+          <w:sz w:val="18"/>
+        </w:rPr>
+        <w:t>Figure 2: Year out of range (1200 &lt; 1450) rejected with @Min constraint and red border (Task 2.5 Case 2)</w:t>
+      </w:r>
+    </w:p>
+    <w:p>
+      <w:pPr>
+        <w:spacing w:before="120" w:after="40"/>
+        <w:jc w:val="center"/>
+      </w:pPr>
+      <w:r>
+        <w:drawing>
+          <wp:inline xmlns:a="http://schemas.openxmlformats.org/drawingml/2006/main" xmlns:pic="http://schemas.openxmlformats.org/drawingml/2006/picture">
+            <wp:extent cx="5486400" cy="2909292"/>
+            <wp:docPr id="3" name="Picture 3"/>
+            <wp:cNvGraphicFramePr>
+              <a:graphicFrameLocks noChangeAspect="1"/>
+            </wp:cNvGraphicFramePr>
+            <a:graphic>
+              <a:graphicData uri="http://schemas.openxmlformats.org/drawingml/2006/picture">
+                <pic:pic>
+                  <pic:nvPicPr>
+                    <pic:cNvPr id="0" name="screenshot_no_genre.png"/>
+                    <pic:cNvPicPr/>
+                  </pic:nvPicPr>
+                  <pic:blipFill>
+                    <a:blip r:embed="rId11"/>
+                    <a:stretch>
+                      <a:fillRect/>
+                    </a:stretch>
+                  </pic:blipFill>
+                  <pic:spPr>
+                    <a:xfrm>
+                      <a:off x="0" y="0"/>
+                      <a:ext cx="5486400" cy="2909292"/>
+                    </a:xfrm>
+                    <a:prstGeom prst="rect"/>
+                  </pic:spPr>
+                </pic:pic>
+              </a:graphicData>
+            </a:graphic>
+          </wp:inline>
+        </w:drawing>
+      </w:r>
+    </w:p>
+    <w:p>
+      <w:pPr>
+        <w:spacing w:before="0" w:after="160"/>
+        <w:jc w:val="center"/>
+      </w:pPr>
+      <w:r>
+        <w:rPr>
+          <w:i/>
+          <w:color w:val="475569"/>
+          <w:sz w:val="18"/>
+        </w:rPr>
+        <w:t>Figure 3: Unselected genre rejected with @NotNull constraint (Task 2.5 Case 3)</w:t>
+      </w:r>
+    </w:p>
+    <w:p>
+      <w:pPr>
+        <w:spacing w:before="120" w:after="40"/>
+        <w:jc w:val="center"/>
+      </w:pPr>
+      <w:r>
+        <w:drawing>
+          <wp:inline xmlns:a="http://schemas.openxmlformats.org/drawingml/2006/main" xmlns:pic="http://schemas.openxmlformats.org/drawingml/2006/picture">
+            <wp:extent cx="5486400" cy="2930723"/>
+            <wp:docPr id="4" name="Picture 4"/>
+            <wp:cNvGraphicFramePr>
+              <a:graphicFrameLocks noChangeAspect="1"/>
+            </wp:cNvGraphicFramePr>
+            <a:graphic>
+              <a:graphicData uri="http://schemas.openxmlformats.org/drawingml/2006/picture">
+                <pic:pic>
+                  <pic:nvPicPr>
+                    <pic:cNvPr id="0" name="screenshot_variant2_reprint_year.png"/>
+                    <pic:cNvPicPr/>
+                  </pic:nvPicPr>
+                  <pic:blipFill>
+                    <a:blip r:embed="rId12"/>
+                    <a:stretch>
+                      <a:fillRect/>
+                    </a:stretch>
+                  </pic:blipFill>
+                  <pic:spPr>
+                    <a:xfrm>
+                      <a:off x="0" y="0"/>
+                      <a:ext cx="5486400" cy="2930723"/>
+                    </a:xfrm>
+                    <a:prstGeom prst="rect"/>
+                  </pic:spPr>
+                </pic:pic>
+              </a:graphicData>
+            </a:graphic>
+          </wp:inline>
+        </w:drawing>
+      </w:r>
+    </w:p>
+    <w:p>
+      <w:pPr>
+        <w:spacing w:before="0" w:after="160"/>
+        <w:jc w:val="center"/>
+      </w:pPr>
+      <w:r>
+        <w:rPr>
+          <w:i/>
+          <w:color w:val="475569"/>
+          <w:sz w:val="18"/>
+        </w:rPr>
+        <w:t>Figure 4: Individual Variant 2 — Class-level constraint violation (Reprint Year 1990 &lt; First Edition 1994) showing global error in orange alert card</w:t>
+      </w:r>
+    </w:p>
+    <w:p>
+      <w:pPr>
+        <w:spacing w:before="120" w:after="40"/>
+        <w:jc w:val="center"/>
+      </w:pPr>
+      <w:r>
+        <w:drawing>
+          <wp:inline xmlns:a="http://schemas.openxmlformats.org/drawingml/2006/main" xmlns:pic="http://schemas.openxmlformats.org/drawingml/2006/picture">
+            <wp:extent cx="5486400" cy="2925366"/>
+            <wp:docPr id="5" name="Picture 5"/>
+            <wp:cNvGraphicFramePr>
+              <a:graphicFrameLocks noChangeAspect="1"/>
+            </wp:cNvGraphicFramePr>
+            <a:graphic>
+              <a:graphicData uri="http://schemas.openxmlformats.org/drawingml/2006/picture">
+                <pic:pic>
+                  <pic:nvPicPr>
+                    <pic:cNvPr id="0" name="screenshot_prg_success.png"/>
+                    <pic:cNvPicPr/>
+                  </pic:nvPicPr>
+                  <pic:blipFill>
+                    <a:blip r:embed="rId13"/>
+                    <a:stretch>
+                      <a:fillRect/>
+                    </a:stretch>
+                  </pic:blipFill>
+                  <pic:spPr>
+                    <a:xfrm>
+                      <a:off x="0" y="0"/>
+                      <a:ext cx="5486400" cy="2925366"/>
+                    </a:xfrm>
+                    <a:prstGeom prst="rect"/>
+                  </pic:spPr>
+                </pic:pic>
+              </a:graphicData>
+            </a:graphic>
+          </wp:inline>
+        </w:drawing>
+      </w:r>
+    </w:p>
+    <w:p>
+      <w:pPr>
+        <w:spacing w:before="0" w:after="160"/>
+        <w:jc w:val="center"/>
+      </w:pPr>
+      <w:r>
+        <w:rPr>
+          <w:i/>
+          <w:color w:val="475569"/>
+          <w:sz w:val="18"/>
+        </w:rPr>
+        <w:t>Figure 5: Post/Redirect/Get successful submission redirecting to /books with green flash banner (Task 2.5 Case 4)</w:t>
+      </w:r>
+    </w:p>
+    <w:p>
+      <w:pPr>
+        <w:spacing w:before="120" w:after="40"/>
+        <w:jc w:val="center"/>
+      </w:pPr>
+      <w:r>
+        <w:drawing>
+          <wp:inline xmlns:a="http://schemas.openxmlformats.org/drawingml/2006/main" xmlns:pic="http://schemas.openxmlformats.org/drawingml/2006/picture">
+            <wp:extent cx="5486400" cy="2903934"/>
+            <wp:docPr id="6" name="Picture 6"/>
+            <wp:cNvGraphicFramePr>
+              <a:graphicFrameLocks noChangeAspect="1"/>
+            </wp:cNvGraphicFramePr>
+            <a:graphic>
+              <a:graphicData uri="http://schemas.openxmlformats.org/drawingml/2006/picture">
+                <pic:pic>
+                  <pic:nvPicPr>
+                    <pic:cNvPr id="0" name="screenshot_github_pr.png"/>
+                    <pic:cNvPicPr/>
+                  </pic:nvPicPr>
+                  <pic:blipFill>
+                    <a:blip r:embed="rId14"/>
+                    <a:stretch>
+                      <a:fillRect/>
+                    </a:stretch>
+                  </pic:blipFill>
+                  <pic:spPr>
+                    <a:xfrm>
+                      <a:off x="0" y="0"/>
+                      <a:ext cx="5486400" cy="2903934"/>
+                    </a:xfrm>
+                    <a:prstGeom prst="rect"/>
+                  </pic:spPr>
+                </pic:pic>
+              </a:graphicData>
+            </a:graphic>
+          </wp:inline>
+        </w:drawing>
+      </w:r>
+    </w:p>
+    <w:p>
+      <w:pPr>
+        <w:spacing w:before="0" w:after="160"/>
+        <w:jc w:val="center"/>
+      </w:pPr>
+      <w:r>
+        <w:rPr>
+          <w:i/>
+          <w:color w:val="475569"/>
+          <w:sz w:val="18"/>
+        </w:rPr>
+        <w:t>Figure 6: Official GitHub Pull Request #5 (lab06 -&gt; main) with all commits and branch comparison</w:t>
       </w:r>
     </w:p>
     <w:p>

</xml_diff>